<commit_message>
Update Candid claims billing docs (#10284)
* Update Candid claims billing docs

Signed-off-by: David Yanez <me@davidyanez.com>

* [autofix.ci] apply automated fixes

---------

Signed-off-by: David Yanez <me@davidyanez.com>
Co-authored-by: autofix-ci[bot] <114827586+autofix-ci[bot]@users.noreply.github.com>
</commit_message>
<xml_diff>
--- a/packages/docs/static/decision-guides/rcm-billing.docx
+++ b/packages/docs/static/decision-guides/rcm-billing.docx
@@ -5290,8 +5290,8 @@
         <w:tblLayout w:type="fixed"/>
       </w:tblPr>
       <w:tblGrid>
-        <w:gridCol w:w="4449"/>
-        <w:gridCol w:w="4911"/>
+        <w:gridCol w:w="4464"/>
+        <w:gridCol w:w="4896"/>
       </w:tblGrid>
       <w:tr>
         <w:trPr>
@@ -5439,7 +5439,7 @@
               <w:t xml:space="preserve">Claim.provider</w:t>
             </w:r>
             <w:r>
-              <w:t xml:space="preserve">, but backends read it differently (billing provider vs. rendering provider with the billing</w:t>
+              <w:t xml:space="preserve">: the billing</w:t>
             </w:r>
             <w:r>
               <w:t xml:space="preserve"> </w:t>
@@ -5454,19 +5454,49 @@
               <w:t xml:space="preserve"> </w:t>
             </w:r>
             <w:r>
-              <w:t xml:space="preserve">via</w:t>
-            </w:r>
-            <w:r>
-              <w:t xml:space="preserve"> </w:t>
-            </w:r>
-            <w:r>
-              <w:rPr>
-                <w:rStyle w:val="VerbatimChar"/>
-              </w:rPr>
-              <w:t xml:space="preserve">PractitionerRole</w:t>
-            </w:r>
-            <w:r>
-              <w:t xml:space="preserve">); confirm per integration.</w:t>
+              <w:t xml:space="preserve">(or a</w:t>
+            </w:r>
+            <w:r>
+              <w:t xml:space="preserve"> </w:t>
+            </w:r>
+            <w:r>
+              <w:rPr>
+                <w:rStyle w:val="VerbatimChar"/>
+              </w:rPr>
+              <w:t xml:space="preserve">Practitioner</w:t>
+            </w:r>
+            <w:r>
+              <w:t xml:space="preserve"> </w:t>
+            </w:r>
+            <w:r>
+              <w:t xml:space="preserve">for individual billing). The rendering provider goes on</w:t>
+            </w:r>
+            <w:r>
+              <w:t xml:space="preserve"> </w:t>
+            </w:r>
+            <w:r>
+              <w:rPr>
+                <w:rStyle w:val="VerbatimChar"/>
+              </w:rPr>
+              <w:t xml:space="preserve">Claim.careTeam</w:t>
+            </w:r>
+            <w:r>
+              <w:t xml:space="preserve"> </w:t>
+            </w:r>
+            <w:r>
+              <w:t xml:space="preserve">with role</w:t>
+            </w:r>
+            <w:r>
+              <w:t xml:space="preserve"> </w:t>
+            </w:r>
+            <w:r>
+              <w:rPr>
+                <w:rStyle w:val="VerbatimChar"/>
+              </w:rPr>
+              <w:t xml:space="preserve">primary</w:t>
+            </w:r>
+            <w:r>
+              <w:t xml:space="preserve">.</w:t>
             </w:r>
           </w:p>
         </w:tc>

</xml_diff>